<commit_message>
Return to $1,000/month with a first-month lead guarantee
Replaces the deferred-fee offer. The fee is payable from month one, and if
we do not deliver at least 25 qualified leads in the first month the second
month is free.

"Qualified" is defined wherever the promise appears rather than left to
interpretation: someone in the practice's service area who gives us their
contact details asking about a treatment the practice offers. The service
agreement carries the same definition plus the conditions the guarantee
depends on, so a shortfall caused by paused campaigns or reduced spend does
not trigger a free month.

Applies to the proposal page, the mailed sheet, the one-page leave-behind,
and the service agreement.

Co-Authored-By: Claude Opus 5 <noreply@anthropic.com>
</commit_message>
<xml_diff>
--- a/onboarding/DentaScale-Service-Agreement-TEMPLATE.docx
+++ b/onboarding/DentaScale-Service-Agreement-TEMPLATE.docx
@@ -34,7 +34,7 @@
         <w:pBdr>
           <w:bottom w:val="single" w:color="1A1A1A" w:sz="12" w:space="8"/>
         </w:pBdr>
-        <w:spacing w:after="290"/>
+        <w:spacing w:after="300"/>
       </w:pPr>
       <w:r>
         <w:rPr>
@@ -62,7 +62,7 @@
     </w:p>
     <w:p>
       <w:pPr>
-        <w:spacing w:after="195"/>
+        <w:spacing w:after="200"/>
       </w:pPr>
       <w:r>
         <w:rPr>
@@ -80,12 +80,12 @@
           <w:sz w:val="21"/>
           <w:szCs w:val="21"/>
         </w:rPr>
-        <w:t xml:space="preserve">_____________________________________________</w:t>
-      </w:r>
-    </w:p>
-    <w:p>
-      <w:pPr>
-        <w:spacing w:after="195"/>
+        <w:t xml:space="preserve">______________________________________________</w:t>
+      </w:r>
+    </w:p>
+    <w:p>
+      <w:pPr>
+        <w:spacing w:after="200"/>
       </w:pPr>
       <w:r>
         <w:rPr>
@@ -103,12 +103,12 @@
           <w:sz w:val="21"/>
           <w:szCs w:val="21"/>
         </w:rPr>
-        <w:t xml:space="preserve">_____________________________________________</w:t>
-      </w:r>
-    </w:p>
-    <w:p>
-      <w:pPr>
-        <w:spacing w:after="195"/>
+        <w:t xml:space="preserve">______________________________________________</w:t>
+      </w:r>
+    </w:p>
+    <w:p>
+      <w:pPr>
+        <w:spacing w:after="200"/>
       </w:pPr>
       <w:r>
         <w:rPr>
@@ -126,12 +126,12 @@
           <w:sz w:val="21"/>
           <w:szCs w:val="21"/>
         </w:rPr>
-        <w:t xml:space="preserve">_____________________________________________</w:t>
-      </w:r>
-    </w:p>
-    <w:p>
-      <w:pPr>
-        <w:spacing w:after="135" w:line="276"/>
+        <w:t xml:space="preserve">______________________________________________</w:t>
+      </w:r>
+    </w:p>
+    <w:p>
+      <w:pPr>
+        <w:spacing w:after="140" w:line="276"/>
       </w:pPr>
       <w:r>
         <w:rPr>
@@ -161,7 +161,7 @@
     <w:p>
       <w:pPr>
         <w:pStyle w:val="Heading1"/>
-        <w:spacing w:after="150" w:before="340"/>
+        <w:spacing w:after="160" w:before="360"/>
       </w:pPr>
       <w:r>
         <w:rPr>
@@ -177,7 +177,7 @@
     </w:p>
     <w:p>
       <w:pPr>
-        <w:spacing w:after="135" w:line="276"/>
+        <w:spacing w:after="140" w:line="276"/>
       </w:pPr>
       <w:r>
         <w:rPr>
@@ -196,7 +196,7 @@
           <w:ilvl w:val="0"/>
           <w:numId w:val="2"/>
         </w:numPr>
-        <w:spacing w:after="75" w:line="272"/>
+        <w:spacing w:after="80" w:line="276"/>
       </w:pPr>
       <w:r>
         <w:rPr>
@@ -215,7 +215,7 @@
           <w:ilvl w:val="0"/>
           <w:numId w:val="2"/>
         </w:numPr>
-        <w:spacing w:after="75" w:line="272"/>
+        <w:spacing w:after="80" w:line="276"/>
       </w:pPr>
       <w:r>
         <w:rPr>
@@ -234,7 +234,7 @@
           <w:ilvl w:val="0"/>
           <w:numId w:val="2"/>
         </w:numPr>
-        <w:spacing w:after="75" w:line="272"/>
+        <w:spacing w:after="80" w:line="276"/>
       </w:pPr>
       <w:r>
         <w:rPr>
@@ -253,7 +253,7 @@
           <w:ilvl w:val="0"/>
           <w:numId w:val="2"/>
         </w:numPr>
-        <w:spacing w:after="75" w:line="272"/>
+        <w:spacing w:after="80" w:line="276"/>
       </w:pPr>
       <w:r>
         <w:rPr>
@@ -272,7 +272,7 @@
           <w:ilvl w:val="0"/>
           <w:numId w:val="2"/>
         </w:numPr>
-        <w:spacing w:after="75" w:line="272"/>
+        <w:spacing w:after="80" w:line="276"/>
       </w:pPr>
       <w:r>
         <w:rPr>
@@ -291,7 +291,7 @@
           <w:ilvl w:val="0"/>
           <w:numId w:val="2"/>
         </w:numPr>
-        <w:spacing w:after="75" w:line="272"/>
+        <w:spacing w:after="80" w:line="276"/>
       </w:pPr>
       <w:r>
         <w:rPr>
@@ -306,7 +306,7 @@
     <w:p>
       <w:pPr>
         <w:pStyle w:val="Heading1"/>
-        <w:spacing w:after="150" w:before="340"/>
+        <w:spacing w:after="160" w:before="360"/>
       </w:pPr>
       <w:r>
         <w:rPr>
@@ -317,71 +317,41 @@
           <w:sz w:val="26"/>
           <w:szCs w:val="26"/>
         </w:rPr>
-        <w:t xml:space="preserve">2. Fees — deferred until the 30th lead</w:t>
-      </w:r>
-    </w:p>
-    <w:p>
-      <w:pPr>
-        <w:spacing w:after="135" w:line="276"/>
-      </w:pPr>
-      <w:r>
-        <w:rPr>
-          <w:rFonts w:ascii="Calibri" w:cs="Calibri" w:eastAsia="Calibri" w:hAnsi="Calibri"/>
-          <w:b/>
-          <w:bCs/>
-          <w:color w:val="1A1A1A"/>
-          <w:sz w:val="21"/>
-          <w:szCs w:val="21"/>
-        </w:rPr>
-        <w:t xml:space="preserve">DentaScale will perform all setup work described in Section 1 at no charge. No service fee is payable by the Client until 30 leads have been delivered.</w:t>
-      </w:r>
-    </w:p>
-    <w:p>
-      <w:pPr>
-        <w:spacing w:after="135" w:line="276"/>
-      </w:pPr>
-      <w:r>
-        <w:rPr>
-          <w:rFonts w:ascii="Calibri" w:cs="Calibri" w:eastAsia="Calibri" w:hAnsi="Calibri"/>
-          <w:color w:val="1A1A1A"/>
-          <w:sz w:val="21"/>
-          <w:szCs w:val="21"/>
-        </w:rPr>
-        <w:t xml:space="preserve">On delivery of the 30th lead, DentaScale will issue its first invoice for one month of service. Monthly billing then continues on that same calendar day each month for as long as this Agreement remains in effect.</w:t>
-      </w:r>
-    </w:p>
-    <w:p>
-      <w:pPr>
-        <w:spacing w:after="135" w:line="276"/>
-      </w:pPr>
-      <w:r>
-        <w:rPr>
-          <w:rFonts w:ascii="Calibri" w:cs="Calibri" w:eastAsia="Calibri" w:hAnsi="Calibri"/>
-          <w:color w:val="1A1A1A"/>
-          <w:sz w:val="21"/>
-          <w:szCs w:val="21"/>
-        </w:rPr>
-        <w:t xml:space="preserve">The monthly fee is $1,000 for campaigns on one platform (Meta). Two platforms are $2,000 per month and three are $3,000 per month. Invoices are payable within 7 days of issue.</w:t>
-      </w:r>
-    </w:p>
-    <w:p>
-      <w:pPr>
-        <w:spacing w:after="135" w:line="276"/>
-      </w:pPr>
-      <w:r>
-        <w:rPr>
-          <w:rFonts w:ascii="Calibri" w:cs="Calibri" w:eastAsia="Calibri" w:hAnsi="Calibri"/>
-          <w:color w:val="1A1A1A"/>
-          <w:sz w:val="21"/>
-          <w:szCs w:val="21"/>
-        </w:rPr>
-        <w:t xml:space="preserve">A “lead” means an individual who submits their contact details through a campaign run by DentaScale for the Client. Lead count is measured in the advertising platform’s reporting, which both parties accept as the record.</w:t>
+        <w:t xml:space="preserve">2. Fees</w:t>
+      </w:r>
+    </w:p>
+    <w:p>
+      <w:pPr>
+        <w:spacing w:after="140" w:line="276"/>
+      </w:pPr>
+      <w:r>
+        <w:rPr>
+          <w:rFonts w:ascii="Calibri" w:cs="Calibri" w:eastAsia="Calibri" w:hAnsi="Calibri"/>
+          <w:color w:val="1A1A1A"/>
+          <w:sz w:val="21"/>
+          <w:szCs w:val="21"/>
+        </w:rPr>
+        <w:t xml:space="preserve">The monthly fee is $1,000 for campaigns on one platform (Meta). Two platforms are $2,000 per month and three are $3,000 per month.</w:t>
+      </w:r>
+    </w:p>
+    <w:p>
+      <w:pPr>
+        <w:spacing w:after="140" w:line="276"/>
+      </w:pPr>
+      <w:r>
+        <w:rPr>
+          <w:rFonts w:ascii="Calibri" w:cs="Calibri" w:eastAsia="Calibri" w:hAnsi="Calibri"/>
+          <w:color w:val="1A1A1A"/>
+          <w:sz w:val="21"/>
+          <w:szCs w:val="21"/>
+        </w:rPr>
+        <w:t xml:space="preserve">The fee is due in advance on the same calendar day each month, beginning on the Start Date. Invoices are payable within 7 days of issue.</w:t>
       </w:r>
     </w:p>
     <w:p>
       <w:pPr>
         <w:pStyle w:val="Heading1"/>
-        <w:spacing w:after="150" w:before="340"/>
+        <w:spacing w:after="160" w:before="360"/>
       </w:pPr>
       <w:r>
         <w:rPr>
@@ -392,172 +362,53 @@
           <w:sz w:val="26"/>
           <w:szCs w:val="26"/>
         </w:rPr>
-        <w:t xml:space="preserve">3. Advertising spend</w:t>
-      </w:r>
-    </w:p>
-    <w:p>
-      <w:pPr>
-        <w:spacing w:after="135" w:line="276"/>
-      </w:pPr>
-      <w:r>
-        <w:rPr>
-          <w:rFonts w:ascii="Calibri" w:cs="Calibri" w:eastAsia="Calibri" w:hAnsi="Calibri"/>
-          <w:color w:val="1A1A1A"/>
-          <w:sz w:val="21"/>
-          <w:szCs w:val="21"/>
-        </w:rPr>
-        <w:t xml:space="preserve">Advertising spend is separate from DentaScale’s fee and is paid by the Client directly to the advertising platforms. DentaScale does not handle, hold, or invoice advertising spend.</w:t>
-      </w:r>
-    </w:p>
-    <w:p>
-      <w:pPr>
-        <w:spacing w:after="135" w:line="276"/>
-      </w:pPr>
-      <w:r>
-        <w:rPr>
-          <w:rFonts w:ascii="Calibri" w:cs="Calibri" w:eastAsia="Calibri" w:hAnsi="Calibri"/>
-          <w:b/>
-          <w:bCs/>
-          <w:color w:val="1A1A1A"/>
-          <w:sz w:val="21"/>
-          <w:szCs w:val="21"/>
-        </w:rPr>
-        <w:t xml:space="preserve">The Client agrees to maintain advertising spend of at least $50 per day for the duration of this Agreement. This minimum is what makes the deferred fee arrangement in Section 2 possible.</w:t>
-      </w:r>
-    </w:p>
-    <w:p>
-      <w:pPr>
-        <w:spacing w:after="135" w:line="276"/>
-      </w:pPr>
-      <w:r>
-        <w:rPr>
-          <w:rFonts w:ascii="Calibri" w:cs="Calibri" w:eastAsia="Calibri" w:hAnsi="Calibri"/>
-          <w:color w:val="1A1A1A"/>
-          <w:sz w:val="21"/>
-          <w:szCs w:val="21"/>
-        </w:rPr>
-        <w:t xml:space="preserve">If the Client reduces spend below $50 per day, or pauses campaigns other than at DentaScale’s recommendation, DentaScale may issue its first invoice immediately, whether or not 30 leads have been delivered.</w:t>
-      </w:r>
-    </w:p>
-    <w:p>
-      <w:pPr>
-        <w:pStyle w:val="Heading1"/>
-        <w:spacing w:after="150" w:before="340"/>
-      </w:pPr>
-      <w:r>
-        <w:rPr>
-          <w:rFonts w:ascii="Calibri" w:cs="Calibri" w:eastAsia="Calibri" w:hAnsi="Calibri"/>
-          <w:b/>
-          <w:bCs/>
-          <w:color w:val="1A1A1A"/>
-          <w:sz w:val="26"/>
-          <w:szCs w:val="26"/>
-        </w:rPr>
-        <w:t xml:space="preserve">4. Time limit on the deferred fee</w:t>
-      </w:r>
-    </w:p>
-    <w:p>
-      <w:pPr>
-        <w:spacing w:after="135" w:line="276"/>
-      </w:pPr>
-      <w:r>
-        <w:rPr>
-          <w:rFonts w:ascii="Calibri" w:cs="Calibri" w:eastAsia="Calibri" w:hAnsi="Calibri"/>
-          <w:color w:val="1A1A1A"/>
-          <w:sz w:val="21"/>
-          <w:szCs w:val="21"/>
-        </w:rPr>
-        <w:t xml:space="preserve">If 30 leads have not been delivered within 60 days of campaigns going live, either party may end this Agreement on written notice with no fee owed by the Client for work performed to that point.</w:t>
-      </w:r>
-    </w:p>
-    <w:p>
-      <w:pPr>
-        <w:spacing w:after="135" w:line="276"/>
-      </w:pPr>
-      <w:r>
-        <w:rPr>
-          <w:rFonts w:ascii="Calibri" w:cs="Calibri" w:eastAsia="Calibri" w:hAnsi="Calibri"/>
-          <w:color w:val="1A1A1A"/>
-          <w:sz w:val="21"/>
-          <w:szCs w:val="21"/>
-        </w:rPr>
-        <w:t xml:space="preserve">This protects both parties: the Client is never billed for a campaign that did not produce, and DentaScale is not committed to unpaid work indefinitely.</w:t>
-      </w:r>
-    </w:p>
-    <w:p>
-      <w:pPr>
-        <w:pStyle w:val="Heading1"/>
-        <w:spacing w:after="150" w:before="340"/>
-      </w:pPr>
-      <w:r>
-        <w:rPr>
-          <w:rFonts w:ascii="Calibri" w:cs="Calibri" w:eastAsia="Calibri" w:hAnsi="Calibri"/>
-          <w:b/>
-          <w:bCs/>
-          <w:color w:val="1A1A1A"/>
-          <w:sz w:val="26"/>
-          <w:szCs w:val="26"/>
-        </w:rPr>
-        <w:t xml:space="preserve">5. Term and cancellation</w:t>
-      </w:r>
-    </w:p>
-    <w:p>
-      <w:pPr>
-        <w:spacing w:after="135" w:line="276"/>
-      </w:pPr>
-      <w:r>
-        <w:rPr>
-          <w:rFonts w:ascii="Calibri" w:cs="Calibri" w:eastAsia="Calibri" w:hAnsi="Calibri"/>
-          <w:color w:val="1A1A1A"/>
-          <w:sz w:val="21"/>
-          <w:szCs w:val="21"/>
-        </w:rPr>
-        <w:t xml:space="preserve">This Agreement runs month to month. There is no minimum term.</w:t>
-      </w:r>
-    </w:p>
-    <w:p>
-      <w:pPr>
-        <w:spacing w:after="135" w:line="276"/>
-      </w:pPr>
-      <w:r>
-        <w:rPr>
-          <w:rFonts w:ascii="Calibri" w:cs="Calibri" w:eastAsia="Calibri" w:hAnsi="Calibri"/>
-          <w:color w:val="1A1A1A"/>
-          <w:sz w:val="21"/>
-          <w:szCs w:val="21"/>
-        </w:rPr>
-        <w:t xml:space="preserve">Either party may cancel by giving written notice (email is sufficient) at least 7 days before the next billing date. Fees already paid for the current month are non-refundable, and DentaScale will complete the month in full.</w:t>
-      </w:r>
-    </w:p>
-    <w:p>
-      <w:pPr>
-        <w:spacing w:after="135" w:line="276"/>
-      </w:pPr>
-      <w:r>
-        <w:rPr>
-          <w:rFonts w:ascii="Calibri" w:cs="Calibri" w:eastAsia="Calibri" w:hAnsi="Calibri"/>
-          <w:color w:val="1A1A1A"/>
-          <w:sz w:val="21"/>
-          <w:szCs w:val="21"/>
-        </w:rPr>
-        <w:t xml:space="preserve">On cancellation, DentaScale will return control of any advertising accounts it created on the Client’s behalf and remove its own access within 5 business days.</w:t>
-      </w:r>
-    </w:p>
-    <w:p>
-      <w:pPr>
-        <w:pStyle w:val="Heading1"/>
-        <w:spacing w:after="150" w:before="340"/>
-      </w:pPr>
-      <w:r>
-        <w:rPr>
-          <w:rFonts w:ascii="Calibri" w:cs="Calibri" w:eastAsia="Calibri" w:hAnsi="Calibri"/>
-          <w:b/>
-          <w:bCs/>
-          <w:color w:val="1A1A1A"/>
-          <w:sz w:val="26"/>
-          <w:szCs w:val="26"/>
-        </w:rPr>
-        <w:t xml:space="preserve">6. Client responsibilities</w:t>
+        <w:t xml:space="preserve">3. First-month lead guarantee</w:t>
+      </w:r>
+    </w:p>
+    <w:p>
+      <w:pPr>
+        <w:spacing w:after="140" w:line="276"/>
+      </w:pPr>
+      <w:r>
+        <w:rPr>
+          <w:rFonts w:ascii="Calibri" w:cs="Calibri" w:eastAsia="Calibri" w:hAnsi="Calibri"/>
+          <w:b/>
+          <w:bCs/>
+          <w:color w:val="1A1A1A"/>
+          <w:sz w:val="21"/>
+          <w:szCs w:val="21"/>
+        </w:rPr>
+        <w:t xml:space="preserve">If DentaScale does not deliver at least 25 qualified leads during the Client’s first month of active advertising, the Client’s second month of service fees is waived. The Client remains responsible for advertising spend in that month.</w:t>
+      </w:r>
+    </w:p>
+    <w:p>
+      <w:pPr>
+        <w:spacing w:after="140" w:line="276"/>
+      </w:pPr>
+      <w:r>
+        <w:rPr>
+          <w:rFonts w:ascii="Calibri" w:cs="Calibri" w:eastAsia="Calibri" w:hAnsi="Calibri"/>
+          <w:color w:val="1A1A1A"/>
+          <w:sz w:val="21"/>
+          <w:szCs w:val="21"/>
+        </w:rPr>
+        <w:t xml:space="preserve">For the purposes of this Agreement, a “qualified lead” means an individual who: (a) submits their contact details through a campaign run by DentaScale for the Client; (b) is located within the Client’s stated service area; and (c) enquires about a treatment the Client offers. Lead count is measured in the advertising platform’s reporting together with the campaign’s lead records, which both parties accept as the record.</w:t>
+      </w:r>
+    </w:p>
+    <w:p>
+      <w:pPr>
+        <w:spacing w:after="80" w:line="276"/>
+      </w:pPr>
+      <w:r>
+        <w:rPr>
+          <w:rFonts w:ascii="Calibri" w:cs="Calibri" w:eastAsia="Calibri" w:hAnsi="Calibri"/>
+          <w:b/>
+          <w:bCs/>
+          <w:color w:val="1A1A1A"/>
+          <w:sz w:val="21"/>
+          <w:szCs w:val="21"/>
+        </w:rPr>
+        <w:t xml:space="preserve">The guarantee is conditional on all of the following:</w:t>
       </w:r>
     </w:p>
     <w:p>
@@ -567,16 +418,16 @@
           <w:ilvl w:val="0"/>
           <w:numId w:val="2"/>
         </w:numPr>
-        <w:spacing w:after="75" w:line="272"/>
-      </w:pPr>
-      <w:r>
-        <w:rPr>
-          <w:rFonts w:ascii="Calibri" w:cs="Calibri" w:eastAsia="Calibri" w:hAnsi="Calibri"/>
-          <w:color w:val="1A1A1A"/>
-          <w:sz w:val="21"/>
-          <w:szCs w:val="21"/>
-        </w:rPr>
-        <w:t xml:space="preserve">Provide account access as set out in the onboarding access guide within 5 business days</w:t>
+        <w:spacing w:after="80" w:line="276"/>
+      </w:pPr>
+      <w:r>
+        <w:rPr>
+          <w:rFonts w:ascii="Calibri" w:cs="Calibri" w:eastAsia="Calibri" w:hAnsi="Calibri"/>
+          <w:color w:val="1A1A1A"/>
+          <w:sz w:val="21"/>
+          <w:szCs w:val="21"/>
+        </w:rPr>
+        <w:t xml:space="preserve">The Client maintains advertising spend of at least $50 per day for the full month</w:t>
       </w:r>
     </w:p>
     <w:p>
@@ -586,16 +437,16 @@
           <w:ilvl w:val="0"/>
           <w:numId w:val="2"/>
         </w:numPr>
-        <w:spacing w:after="75" w:line="272"/>
-      </w:pPr>
-      <w:r>
-        <w:rPr>
-          <w:rFonts w:ascii="Calibri" w:cs="Calibri" w:eastAsia="Calibri" w:hAnsi="Calibri"/>
-          <w:color w:val="1A1A1A"/>
-          <w:sz w:val="21"/>
-          <w:szCs w:val="21"/>
-        </w:rPr>
-        <w:t xml:space="preserve">Maintain advertising spend of at least $50 per day</w:t>
+        <w:spacing w:after="80" w:line="276"/>
+      </w:pPr>
+      <w:r>
+        <w:rPr>
+          <w:rFonts w:ascii="Calibri" w:cs="Calibri" w:eastAsia="Calibri" w:hAnsi="Calibri"/>
+          <w:color w:val="1A1A1A"/>
+          <w:sz w:val="21"/>
+          <w:szCs w:val="21"/>
+        </w:rPr>
+        <w:t xml:space="preserve">Campaigns run for a continuous period of at least 30 days without being paused at the Client’s request</w:t>
       </w:r>
     </w:p>
     <w:p>
@@ -605,16 +456,16 @@
           <w:ilvl w:val="0"/>
           <w:numId w:val="2"/>
         </w:numPr>
-        <w:spacing w:after="75" w:line="272"/>
-      </w:pPr>
-      <w:r>
-        <w:rPr>
-          <w:rFonts w:ascii="Calibri" w:cs="Calibri" w:eastAsia="Calibri" w:hAnsi="Calibri"/>
-          <w:color w:val="1A1A1A"/>
-          <w:sz w:val="21"/>
-          <w:szCs w:val="21"/>
-        </w:rPr>
-        <w:t xml:space="preserve">Provide reasonable access for the content shoot and approve creative without undue delay</w:t>
+        <w:spacing w:after="80" w:line="276"/>
+      </w:pPr>
+      <w:r>
+        <w:rPr>
+          <w:rFonts w:ascii="Calibri" w:cs="Calibri" w:eastAsia="Calibri" w:hAnsi="Calibri"/>
+          <w:color w:val="1A1A1A"/>
+          <w:sz w:val="21"/>
+          <w:szCs w:val="21"/>
+        </w:rPr>
+        <w:t xml:space="preserve">The Client provides account access and any requested materials within 5 business days of the Start Date</w:t>
       </w:r>
     </w:p>
     <w:p>
@@ -624,16 +475,151 @@
           <w:ilvl w:val="0"/>
           <w:numId w:val="2"/>
         </w:numPr>
-        <w:spacing w:after="75" w:line="272"/>
-      </w:pPr>
-      <w:r>
-        <w:rPr>
-          <w:rFonts w:ascii="Calibri" w:cs="Calibri" w:eastAsia="Calibri" w:hAnsi="Calibri"/>
-          <w:color w:val="1A1A1A"/>
-          <w:sz w:val="21"/>
-          <w:szCs w:val="21"/>
-        </w:rPr>
-        <w:t xml:space="preserve">Respond to leads promptly — speed of response materially affects results</w:t>
+        <w:spacing w:after="80" w:line="276"/>
+      </w:pPr>
+      <w:r>
+        <w:rPr>
+          <w:rFonts w:ascii="Calibri" w:cs="Calibri" w:eastAsia="Calibri" w:hAnsi="Calibri"/>
+          <w:color w:val="1A1A1A"/>
+          <w:sz w:val="21"/>
+          <w:szCs w:val="21"/>
+        </w:rPr>
+        <w:t xml:space="preserve">The Client does not materially change the agreed offer mid-month without DentaScale’s agreement</w:t>
+      </w:r>
+    </w:p>
+    <w:p>
+      <w:pPr>
+        <w:spacing w:after="140" w:line="276"/>
+      </w:pPr>
+      <w:r>
+        <w:rPr>
+          <w:rFonts w:ascii="Calibri" w:cs="Calibri" w:eastAsia="Calibri" w:hAnsi="Calibri"/>
+          <w:color w:val="1A1A1A"/>
+          <w:sz w:val="21"/>
+          <w:szCs w:val="21"/>
+        </w:rPr>
+        <w:t xml:space="preserve">The guarantee relates to lead volume only. DentaScale does not guarantee that any lead will book an appointment, attend an appointment, or accept treatment, as those outcomes depend on the Client’s own follow-up and practice operations.</w:t>
+      </w:r>
+    </w:p>
+    <w:p>
+      <w:pPr>
+        <w:pStyle w:val="Heading1"/>
+        <w:spacing w:after="160" w:before="360"/>
+      </w:pPr>
+      <w:r>
+        <w:rPr>
+          <w:rFonts w:ascii="Calibri" w:cs="Calibri" w:eastAsia="Calibri" w:hAnsi="Calibri"/>
+          <w:b/>
+          <w:bCs/>
+          <w:color w:val="1A1A1A"/>
+          <w:sz w:val="26"/>
+          <w:szCs w:val="26"/>
+        </w:rPr>
+        <w:t xml:space="preserve">4. Advertising spend</w:t>
+      </w:r>
+    </w:p>
+    <w:p>
+      <w:pPr>
+        <w:spacing w:after="140" w:line="276"/>
+      </w:pPr>
+      <w:r>
+        <w:rPr>
+          <w:rFonts w:ascii="Calibri" w:cs="Calibri" w:eastAsia="Calibri" w:hAnsi="Calibri"/>
+          <w:color w:val="1A1A1A"/>
+          <w:sz w:val="21"/>
+          <w:szCs w:val="21"/>
+        </w:rPr>
+        <w:t xml:space="preserve">Advertising spend is separate from DentaScale’s fee and is paid by the Client directly to the advertising platforms. DentaScale does not handle, hold, or invoice advertising spend.</w:t>
+      </w:r>
+    </w:p>
+    <w:p>
+      <w:pPr>
+        <w:spacing w:after="140" w:line="276"/>
+      </w:pPr>
+      <w:r>
+        <w:rPr>
+          <w:rFonts w:ascii="Calibri" w:cs="Calibri" w:eastAsia="Calibri" w:hAnsi="Calibri"/>
+          <w:color w:val="1A1A1A"/>
+          <w:sz w:val="21"/>
+          <w:szCs w:val="21"/>
+        </w:rPr>
+        <w:t xml:space="preserve">The Client agrees to maintain advertising spend of at least $50 per day. Raising the budget above this level does not change DentaScale’s fee.</w:t>
+      </w:r>
+    </w:p>
+    <w:p>
+      <w:pPr>
+        <w:pStyle w:val="Heading1"/>
+        <w:spacing w:after="160" w:before="360"/>
+      </w:pPr>
+      <w:r>
+        <w:rPr>
+          <w:rFonts w:ascii="Calibri" w:cs="Calibri" w:eastAsia="Calibri" w:hAnsi="Calibri"/>
+          <w:b/>
+          <w:bCs/>
+          <w:color w:val="1A1A1A"/>
+          <w:sz w:val="26"/>
+          <w:szCs w:val="26"/>
+        </w:rPr>
+        <w:t xml:space="preserve">5. Term and cancellation</w:t>
+      </w:r>
+    </w:p>
+    <w:p>
+      <w:pPr>
+        <w:spacing w:after="140" w:line="276"/>
+      </w:pPr>
+      <w:r>
+        <w:rPr>
+          <w:rFonts w:ascii="Calibri" w:cs="Calibri" w:eastAsia="Calibri" w:hAnsi="Calibri"/>
+          <w:color w:val="1A1A1A"/>
+          <w:sz w:val="21"/>
+          <w:szCs w:val="21"/>
+        </w:rPr>
+        <w:t xml:space="preserve">This Agreement runs month to month. There is no minimum term.</w:t>
+      </w:r>
+    </w:p>
+    <w:p>
+      <w:pPr>
+        <w:spacing w:after="140" w:line="276"/>
+      </w:pPr>
+      <w:r>
+        <w:rPr>
+          <w:rFonts w:ascii="Calibri" w:cs="Calibri" w:eastAsia="Calibri" w:hAnsi="Calibri"/>
+          <w:color w:val="1A1A1A"/>
+          <w:sz w:val="21"/>
+          <w:szCs w:val="21"/>
+        </w:rPr>
+        <w:t xml:space="preserve">Either party may cancel by giving written notice (email is sufficient) at least 7 days before the next billing date. Fees already paid for the current month are non-refundable, and DentaScale will complete the month in full.</w:t>
+      </w:r>
+    </w:p>
+    <w:p>
+      <w:pPr>
+        <w:spacing w:after="140" w:line="276"/>
+      </w:pPr>
+      <w:r>
+        <w:rPr>
+          <w:rFonts w:ascii="Calibri" w:cs="Calibri" w:eastAsia="Calibri" w:hAnsi="Calibri"/>
+          <w:color w:val="1A1A1A"/>
+          <w:sz w:val="21"/>
+          <w:szCs w:val="21"/>
+        </w:rPr>
+        <w:t xml:space="preserve">On cancellation, DentaScale will return control of any advertising accounts it created on the Client’s behalf and remove its own access within 5 business days.</w:t>
+      </w:r>
+    </w:p>
+    <w:p>
+      <w:pPr>
+        <w:pStyle w:val="Heading1"/>
+        <w:spacing w:after="160" w:before="360"/>
+      </w:pPr>
+      <w:r>
+        <w:rPr>
+          <w:rFonts w:ascii="Calibri" w:cs="Calibri" w:eastAsia="Calibri" w:hAnsi="Calibri"/>
+          <w:b/>
+          <w:bCs/>
+          <w:color w:val="1A1A1A"/>
+          <w:sz w:val="26"/>
+          <w:szCs w:val="26"/>
+        </w:rPr>
+        <w:t xml:space="preserve">6. Client responsibilities</w:t>
       </w:r>
     </w:p>
     <w:p>
@@ -643,7 +629,83 @@
           <w:ilvl w:val="0"/>
           <w:numId w:val="2"/>
         </w:numPr>
-        <w:spacing w:after="75" w:line="272"/>
+        <w:spacing w:after="80" w:line="276"/>
+      </w:pPr>
+      <w:r>
+        <w:rPr>
+          <w:rFonts w:ascii="Calibri" w:cs="Calibri" w:eastAsia="Calibri" w:hAnsi="Calibri"/>
+          <w:color w:val="1A1A1A"/>
+          <w:sz w:val="21"/>
+          <w:szCs w:val="21"/>
+        </w:rPr>
+        <w:t xml:space="preserve">Provide account access as set out in the onboarding access guide within 5 business days</w:t>
+      </w:r>
+    </w:p>
+    <w:p>
+      <w:pPr>
+        <w:pStyle w:val="ListParagraph"/>
+        <w:numPr>
+          <w:ilvl w:val="0"/>
+          <w:numId w:val="2"/>
+        </w:numPr>
+        <w:spacing w:after="80" w:line="276"/>
+      </w:pPr>
+      <w:r>
+        <w:rPr>
+          <w:rFonts w:ascii="Calibri" w:cs="Calibri" w:eastAsia="Calibri" w:hAnsi="Calibri"/>
+          <w:color w:val="1A1A1A"/>
+          <w:sz w:val="21"/>
+          <w:szCs w:val="21"/>
+        </w:rPr>
+        <w:t xml:space="preserve">Maintain advertising spend of at least $50 per day</w:t>
+      </w:r>
+    </w:p>
+    <w:p>
+      <w:pPr>
+        <w:pStyle w:val="ListParagraph"/>
+        <w:numPr>
+          <w:ilvl w:val="0"/>
+          <w:numId w:val="2"/>
+        </w:numPr>
+        <w:spacing w:after="80" w:line="276"/>
+      </w:pPr>
+      <w:r>
+        <w:rPr>
+          <w:rFonts w:ascii="Calibri" w:cs="Calibri" w:eastAsia="Calibri" w:hAnsi="Calibri"/>
+          <w:color w:val="1A1A1A"/>
+          <w:sz w:val="21"/>
+          <w:szCs w:val="21"/>
+        </w:rPr>
+        <w:t xml:space="preserve">Provide reasonable access for the content shoot and approve creative without undue delay</w:t>
+      </w:r>
+    </w:p>
+    <w:p>
+      <w:pPr>
+        <w:pStyle w:val="ListParagraph"/>
+        <w:numPr>
+          <w:ilvl w:val="0"/>
+          <w:numId w:val="2"/>
+        </w:numPr>
+        <w:spacing w:after="80" w:line="276"/>
+      </w:pPr>
+      <w:r>
+        <w:rPr>
+          <w:rFonts w:ascii="Calibri" w:cs="Calibri" w:eastAsia="Calibri" w:hAnsi="Calibri"/>
+          <w:color w:val="1A1A1A"/>
+          <w:sz w:val="21"/>
+          <w:szCs w:val="21"/>
+        </w:rPr>
+        <w:t xml:space="preserve">Respond to leads promptly — speed of response materially affects results</w:t>
+      </w:r>
+    </w:p>
+    <w:p>
+      <w:pPr>
+        <w:pStyle w:val="ListParagraph"/>
+        <w:numPr>
+          <w:ilvl w:val="0"/>
+          <w:numId w:val="2"/>
+        </w:numPr>
+        <w:spacing w:after="80" w:line="276"/>
       </w:pPr>
       <w:r>
         <w:rPr>
@@ -658,7 +720,7 @@
     <w:p>
       <w:pPr>
         <w:pStyle w:val="Heading1"/>
-        <w:spacing w:after="150" w:before="340"/>
+        <w:spacing w:after="160" w:before="360"/>
       </w:pPr>
       <w:r>
         <w:rPr>
@@ -674,21 +736,21 @@
     </w:p>
     <w:p>
       <w:pPr>
-        <w:spacing w:after="135" w:line="276"/>
-      </w:pPr>
-      <w:r>
-        <w:rPr>
-          <w:rFonts w:ascii="Calibri" w:cs="Calibri" w:eastAsia="Calibri" w:hAnsi="Calibri"/>
-          <w:color w:val="1A1A1A"/>
-          <w:sz w:val="21"/>
-          <w:szCs w:val="21"/>
-        </w:rPr>
-        <w:t xml:space="preserve">Advertising creative, copy, campaign structures, and the booking funnel produced under this Agreement become the property of the Client once the first invoice has been paid. Until that point they remain the property of DentaScale and are licensed to the Client for use in the campaigns run under this Agreement.</w:t>
-      </w:r>
-    </w:p>
-    <w:p>
-      <w:pPr>
-        <w:spacing w:after="135" w:line="276"/>
+        <w:spacing w:after="140" w:line="276"/>
+      </w:pPr>
+      <w:r>
+        <w:rPr>
+          <w:rFonts w:ascii="Calibri" w:cs="Calibri" w:eastAsia="Calibri" w:hAnsi="Calibri"/>
+          <w:color w:val="1A1A1A"/>
+          <w:sz w:val="21"/>
+          <w:szCs w:val="21"/>
+        </w:rPr>
+        <w:t xml:space="preserve">Advertising creative, copy, campaign structures, and the booking funnel produced under this Agreement become the property of the Client on payment of the relevant month’s fee.</w:t>
+      </w:r>
+    </w:p>
+    <w:p>
+      <w:pPr>
+        <w:spacing w:after="140" w:line="276"/>
       </w:pPr>
       <w:r>
         <w:rPr>
@@ -702,7 +764,7 @@
     </w:p>
     <w:p>
       <w:pPr>
-        <w:spacing w:after="135" w:line="276"/>
+        <w:spacing w:after="140" w:line="276"/>
       </w:pPr>
       <w:r>
         <w:rPr>
@@ -717,7 +779,7 @@
     <w:p>
       <w:pPr>
         <w:pStyle w:val="Heading1"/>
-        <w:spacing w:after="150" w:before="340"/>
+        <w:spacing w:after="160" w:before="360"/>
       </w:pPr>
       <w:r>
         <w:rPr>
@@ -728,27 +790,41 @@
           <w:sz w:val="26"/>
           <w:szCs w:val="26"/>
         </w:rPr>
-        <w:t xml:space="preserve">8. What is not promised</w:t>
-      </w:r>
-    </w:p>
-    <w:p>
-      <w:pPr>
-        <w:spacing w:after="135" w:line="276"/>
-      </w:pPr>
-      <w:r>
-        <w:rPr>
-          <w:rFonts w:ascii="Calibri" w:cs="Calibri" w:eastAsia="Calibri" w:hAnsi="Calibri"/>
-          <w:color w:val="1A1A1A"/>
-          <w:sz w:val="21"/>
-          <w:szCs w:val="21"/>
-        </w:rPr>
-        <w:t xml:space="preserve">DentaScale does not guarantee that any lead will book an appointment, attend an appointment, or accept treatment. Those outcomes depend on the Client’s own follow-up and practice operations, which DentaScale does not control.</w:t>
+        <w:t xml:space="preserve">8. Confidentiality and data</w:t>
+      </w:r>
+    </w:p>
+    <w:p>
+      <w:pPr>
+        <w:spacing w:after="140" w:line="276"/>
+      </w:pPr>
+      <w:r>
+        <w:rPr>
+          <w:rFonts w:ascii="Calibri" w:cs="Calibri" w:eastAsia="Calibri" w:hAnsi="Calibri"/>
+          <w:color w:val="1A1A1A"/>
+          <w:sz w:val="21"/>
+          <w:szCs w:val="21"/>
+        </w:rPr>
+        <w:t xml:space="preserve">Each party will keep the other’s non-public business information confidential.</w:t>
+      </w:r>
+    </w:p>
+    <w:p>
+      <w:pPr>
+        <w:spacing w:after="140" w:line="276"/>
+      </w:pPr>
+      <w:r>
+        <w:rPr>
+          <w:rFonts w:ascii="Calibri" w:cs="Calibri" w:eastAsia="Calibri" w:hAnsi="Calibri"/>
+          <w:color w:val="1A1A1A"/>
+          <w:sz w:val="21"/>
+          <w:szCs w:val="21"/>
+        </w:rPr>
+        <w:t xml:space="preserve">The Client acknowledges that DentaScale is engaged for advertising services and is not engaged to receive, create, or maintain protected health information. The Client will not provide DentaScale with patient clinical records. Where lead contact details are handled, DentaScale will use reasonable safeguards to protect them.</w:t>
       </w:r>
     </w:p>
     <w:p>
       <w:pPr>
         <w:pStyle w:val="Heading1"/>
-        <w:spacing w:after="150" w:before="340"/>
+        <w:spacing w:after="160" w:before="360"/>
       </w:pPr>
       <w:r>
         <w:rPr>
@@ -759,41 +835,41 @@
           <w:sz w:val="26"/>
           <w:szCs w:val="26"/>
         </w:rPr>
-        <w:t xml:space="preserve">9. Confidentiality and data</w:t>
-      </w:r>
-    </w:p>
-    <w:p>
-      <w:pPr>
-        <w:spacing w:after="135" w:line="276"/>
-      </w:pPr>
-      <w:r>
-        <w:rPr>
-          <w:rFonts w:ascii="Calibri" w:cs="Calibri" w:eastAsia="Calibri" w:hAnsi="Calibri"/>
-          <w:color w:val="1A1A1A"/>
-          <w:sz w:val="21"/>
-          <w:szCs w:val="21"/>
-        </w:rPr>
-        <w:t xml:space="preserve">Each party will keep the other’s non-public business information confidential.</w:t>
-      </w:r>
-    </w:p>
-    <w:p>
-      <w:pPr>
-        <w:spacing w:after="135" w:line="276"/>
-      </w:pPr>
-      <w:r>
-        <w:rPr>
-          <w:rFonts w:ascii="Calibri" w:cs="Calibri" w:eastAsia="Calibri" w:hAnsi="Calibri"/>
-          <w:color w:val="1A1A1A"/>
-          <w:sz w:val="21"/>
-          <w:szCs w:val="21"/>
-        </w:rPr>
-        <w:t xml:space="preserve">The Client acknowledges that DentaScale is engaged for advertising services and is not engaged to receive, create, or maintain protected health information. The Client will not provide DentaScale with patient clinical records. Where lead contact details are handled, DentaScale will use reasonable safeguards to protect them.</w:t>
+        <w:t xml:space="preserve">9. Limitation of liability</w:t>
+      </w:r>
+    </w:p>
+    <w:p>
+      <w:pPr>
+        <w:spacing w:after="140" w:line="276"/>
+      </w:pPr>
+      <w:r>
+        <w:rPr>
+          <w:rFonts w:ascii="Calibri" w:cs="Calibri" w:eastAsia="Calibri" w:hAnsi="Calibri"/>
+          <w:color w:val="1A1A1A"/>
+          <w:sz w:val="21"/>
+          <w:szCs w:val="21"/>
+        </w:rPr>
+        <w:t xml:space="preserve">DentaScale’s total liability under this Agreement is limited to the fees paid by the Client in the three months preceding the event giving rise to the claim. Neither party is liable for indirect or consequential losses, including lost profits.</w:t>
+      </w:r>
+    </w:p>
+    <w:p>
+      <w:pPr>
+        <w:spacing w:after="140" w:line="276"/>
+      </w:pPr>
+      <w:r>
+        <w:rPr>
+          <w:rFonts w:ascii="Calibri" w:cs="Calibri" w:eastAsia="Calibri" w:hAnsi="Calibri"/>
+          <w:color w:val="1A1A1A"/>
+          <w:sz w:val="21"/>
+          <w:szCs w:val="21"/>
+        </w:rPr>
+        <w:t xml:space="preserve">Advertising platforms may reject ads, suspend accounts, or change policies for reasons outside DentaScale’s control. DentaScale is not liable for such actions but will work in good faith to resolve them.</w:t>
       </w:r>
     </w:p>
     <w:p>
       <w:pPr>
         <w:pStyle w:val="Heading1"/>
-        <w:spacing w:after="150" w:before="340"/>
+        <w:spacing w:after="160" w:before="360"/>
       </w:pPr>
       <w:r>
         <w:rPr>
@@ -804,57 +880,12 @@
           <w:sz w:val="26"/>
           <w:szCs w:val="26"/>
         </w:rPr>
-        <w:t xml:space="preserve">10. Limitation of liability</w:t>
-      </w:r>
-    </w:p>
-    <w:p>
-      <w:pPr>
-        <w:spacing w:after="135" w:line="276"/>
-      </w:pPr>
-      <w:r>
-        <w:rPr>
-          <w:rFonts w:ascii="Calibri" w:cs="Calibri" w:eastAsia="Calibri" w:hAnsi="Calibri"/>
-          <w:color w:val="1A1A1A"/>
-          <w:sz w:val="21"/>
-          <w:szCs w:val="21"/>
-        </w:rPr>
-        <w:t xml:space="preserve">DentaScale’s total liability under this Agreement is limited to the fees paid by the Client in the three months preceding the event giving rise to the claim. Neither party is liable for indirect or consequential losses, including lost profits.</w:t>
-      </w:r>
-    </w:p>
-    <w:p>
-      <w:pPr>
-        <w:spacing w:after="135" w:line="276"/>
-      </w:pPr>
-      <w:r>
-        <w:rPr>
-          <w:rFonts w:ascii="Calibri" w:cs="Calibri" w:eastAsia="Calibri" w:hAnsi="Calibri"/>
-          <w:color w:val="1A1A1A"/>
-          <w:sz w:val="21"/>
-          <w:szCs w:val="21"/>
-        </w:rPr>
-        <w:t xml:space="preserve">Advertising platforms may reject ads, suspend accounts, or change policies for reasons outside DentaScale’s control. DentaScale is not liable for such actions but will work in good faith to resolve them.</w:t>
-      </w:r>
-    </w:p>
-    <w:p>
-      <w:pPr>
-        <w:pStyle w:val="Heading1"/>
-        <w:spacing w:after="150" w:before="340"/>
-      </w:pPr>
-      <w:r>
-        <w:rPr>
-          <w:rFonts w:ascii="Calibri" w:cs="Calibri" w:eastAsia="Calibri" w:hAnsi="Calibri"/>
-          <w:b/>
-          <w:bCs/>
-          <w:color w:val="1A1A1A"/>
-          <w:sz w:val="26"/>
-          <w:szCs w:val="26"/>
-        </w:rPr>
-        <w:t xml:space="preserve">11. General</w:t>
-      </w:r>
-    </w:p>
-    <w:p>
-      <w:pPr>
-        <w:spacing w:after="135" w:line="276"/>
+        <w:t xml:space="preserve">10. General</w:t>
+      </w:r>
+    </w:p>
+    <w:p>
+      <w:pPr>
+        <w:spacing w:after="140" w:line="276"/>
       </w:pPr>
       <w:r>
         <w:rPr>
@@ -884,7 +915,7 @@
     <w:p>
       <w:pPr>
         <w:pStyle w:val="Heading1"/>
-        <w:spacing w:after="150" w:before="340"/>
+        <w:spacing w:after="160" w:before="360"/>
       </w:pPr>
       <w:r>
         <w:rPr>
@@ -930,7 +961,7 @@
     </w:p>
     <w:p>
       <w:pPr>
-        <w:spacing w:after="195"/>
+        <w:spacing w:after="200"/>
       </w:pPr>
       <w:r>
         <w:rPr>
@@ -948,12 +979,12 @@
           <w:sz w:val="21"/>
           <w:szCs w:val="21"/>
         </w:rPr>
-        <w:t xml:space="preserve">_____________________________________________</w:t>
-      </w:r>
-    </w:p>
-    <w:p>
-      <w:pPr>
-        <w:spacing w:after="195"/>
+        <w:t xml:space="preserve">______________________________________________</w:t>
+      </w:r>
+    </w:p>
+    <w:p>
+      <w:pPr>
+        <w:spacing w:after="200"/>
       </w:pPr>
       <w:r>
         <w:rPr>
@@ -971,12 +1002,12 @@
           <w:sz w:val="21"/>
           <w:szCs w:val="21"/>
         </w:rPr>
-        <w:t xml:space="preserve">_____________________________________________</w:t>
-      </w:r>
-    </w:p>
-    <w:p>
-      <w:pPr>
-        <w:spacing w:after="195"/>
+        <w:t xml:space="preserve">______________________________________________</w:t>
+      </w:r>
+    </w:p>
+    <w:p>
+      <w:pPr>
+        <w:spacing w:after="200"/>
       </w:pPr>
       <w:r>
         <w:rPr>
@@ -994,7 +1025,7 @@
           <w:sz w:val="21"/>
           <w:szCs w:val="21"/>
         </w:rPr>
-        <w:t xml:space="preserve">_____________________________________________</w:t>
+        <w:t xml:space="preserve">______________________________________________</w:t>
       </w:r>
     </w:p>
     <w:p>
@@ -1015,7 +1046,7 @@
     </w:p>
     <w:p>
       <w:pPr>
-        <w:spacing w:after="195"/>
+        <w:spacing w:after="200"/>
       </w:pPr>
       <w:r>
         <w:rPr>
@@ -1033,7 +1064,7 @@
           <w:sz w:val="21"/>
           <w:szCs w:val="21"/>
         </w:rPr>
-        <w:t xml:space="preserve">_____________________________________________</w:t>
+        <w:t xml:space="preserve">______________________________________________</w:t>
       </w:r>
     </w:p>
     <w:p>
@@ -1052,7 +1083,7 @@
     </w:p>
     <w:p>
       <w:pPr>
-        <w:spacing w:after="195"/>
+        <w:spacing w:after="200"/>
       </w:pPr>
       <w:r>
         <w:rPr>
@@ -1070,12 +1101,12 @@
           <w:sz w:val="21"/>
           <w:szCs w:val="21"/>
         </w:rPr>
-        <w:t xml:space="preserve">_____________________________________________</w:t>
-      </w:r>
-    </w:p>
-    <w:p>
-      <w:pPr>
-        <w:spacing w:before="320"/>
+        <w:t xml:space="preserve">______________________________________________</w:t>
+      </w:r>
+    </w:p>
+    <w:p>
+      <w:pPr>
+        <w:spacing w:before="300"/>
       </w:pPr>
       <w:r>
         <w:rPr>
@@ -1270,18 +1301,6 @@
       <w:lvlJc w:val="left"/>
       <w:pPr>
         <w:ind w:left="431" w:hanging="259"/>
-      </w:pPr>
-    </w:lvl>
-  </w:abstractNum>
-  <w:abstractNum w:abstractNumId="3" w15:restartNumberingAfterBreak="0">
-    <w:multiLevelType w:val="hybridMultilevel"/>
-    <w:lvl w:ilvl="0" w15:tentative="1">
-      <w:start w:val="1"/>
-      <w:numFmt w:val="decimal"/>
-      <w:lvlText w:val="%1."/>
-      <w:lvlJc w:val="left"/>
-      <w:pPr>
-        <w:ind w:left="460" w:hanging="316"/>
       </w:pPr>
     </w:lvl>
   </w:abstractNum>

</xml_diff>

<commit_message>
Services: add offer strategy and follow-up; replace Lead-to-Chair name with in-house sales team
Co-Authored-By: Claude Sonnet 5.5 <noreply@anthropic.com>
</commit_message>
<xml_diff>
--- a/onboarding/DentaScale-Service-Agreement-TEMPLATE.docx
+++ b/onboarding/DentaScale-Service-Agreement-TEMPLATE.docx
@@ -224,7 +224,7 @@
           <w:sz w:val="21"/>
           <w:szCs w:val="21"/>
         </w:rPr>
-        <w:t xml:space="preserve">Ad copy and creative direction</w:t>
+        <w:t xml:space="preserve">Ad copy, creative direction, and help choosing the best offer for the Client’s market</w:t>
       </w:r>
     </w:p>
     <w:p>
@@ -281,7 +281,7 @@
           <w:sz w:val="21"/>
           <w:szCs w:val="21"/>
         </w:rPr>
-        <w:t xml:space="preserve">The Lead-to-Chair System: DentaScale calls each new lead, qualifies them for fit, books qualified patients into the Client’s consultation calendar, follows up on no-answers, and sends consult reminders</w:t>
+        <w:t xml:space="preserve">An in-house DentaScale sales team that calls each new lead, qualifies them for fit, books qualified patients into the Client’s consultation calendar, follows up until each lead gives a clear yes or no, and sends consult reminders</w:t>
       </w:r>
     </w:p>
     <w:p>
@@ -759,7 +759,7 @@
           <w:sz w:val="21"/>
           <w:szCs w:val="21"/>
         </w:rPr>
-        <w:t xml:space="preserve">DentaScale retains ownership of its own underlying templates, systems, and methods, including the Lead-to-Chair System, which is licensed to the Client for internal use only.</w:t>
+        <w:t xml:space="preserve">DentaScale retains ownership of its own underlying templates, systems, and methods, including its call scripts and sales processes, which are licensed to the Client for internal use only.</w:t>
       </w:r>
     </w:p>
     <w:p>

</xml_diff>

<commit_message>
Speed to lead is 10 seconds via automation, then real people call; drop the lead guarantee
Removes the 25-lead guarantee from the proposal page, sheet, one-pager and
service agreement (renumbered). One office per market stays.

Co-Authored-By: Claude Sonnet 5.5 <noreply@anthropic.com>
</commit_message>
<xml_diff>
--- a/onboarding/DentaScale-Service-Agreement-TEMPLATE.docx
+++ b/onboarding/DentaScale-Service-Agreement-TEMPLATE.docx
@@ -281,7 +281,7 @@
           <w:sz w:val="21"/>
           <w:szCs w:val="21"/>
         </w:rPr>
-        <w:t xml:space="preserve">An in-house DentaScale sales team that calls each new lead, qualifies them for fit, books qualified patients into the Client’s consultation calendar, follows up until each lead gives a clear yes or no, and sends consult reminders</w:t>
+        <w:t xml:space="preserve">An automated system that contacts each new lead within 10 seconds, followed by an in-house DentaScale sales team that calls each lead, qualifies them for fit, books qualified patients into the Client’s consultation calendar, follows up until each lead gives a clear yes or no, and sends consult reminders</w:t>
       </w:r>
     </w:p>
     <w:p>
@@ -362,12 +362,41 @@
           <w:sz w:val="26"/>
           <w:szCs w:val="26"/>
         </w:rPr>
-        <w:t xml:space="preserve">3. First-month lead guarantee</w:t>
-      </w:r>
-    </w:p>
-    <w:p>
-      <w:pPr>
-        <w:spacing w:after="140" w:line="276"/>
+        <w:t xml:space="preserve">3. Advertising spend</w:t>
+      </w:r>
+    </w:p>
+    <w:p>
+      <w:pPr>
+        <w:spacing w:after="140" w:line="276"/>
+      </w:pPr>
+      <w:r>
+        <w:rPr>
+          <w:rFonts w:ascii="Calibri" w:cs="Calibri" w:eastAsia="Calibri" w:hAnsi="Calibri"/>
+          <w:color w:val="1A1A1A"/>
+          <w:sz w:val="21"/>
+          <w:szCs w:val="21"/>
+        </w:rPr>
+        <w:t xml:space="preserve">Advertising spend is separate from DentaScale’s fee and is paid by the Client directly to the advertising platforms. DentaScale does not handle, hold, or invoice advertising spend.</w:t>
+      </w:r>
+    </w:p>
+    <w:p>
+      <w:pPr>
+        <w:spacing w:after="140" w:line="276"/>
+      </w:pPr>
+      <w:r>
+        <w:rPr>
+          <w:rFonts w:ascii="Calibri" w:cs="Calibri" w:eastAsia="Calibri" w:hAnsi="Calibri"/>
+          <w:color w:val="1A1A1A"/>
+          <w:sz w:val="21"/>
+          <w:szCs w:val="21"/>
+        </w:rPr>
+        <w:t xml:space="preserve">The Client agrees to maintain advertising spend of at least $50 per day. Raising the budget above this level does not change DentaScale’s fee.</w:t>
+      </w:r>
+    </w:p>
+    <w:p>
+      <w:pPr>
+        <w:pStyle w:val="Heading1"/>
+        <w:spacing w:after="160" w:before="360"/>
       </w:pPr>
       <w:r>
         <w:rPr>
@@ -375,29 +404,58 @@
           <w:b/>
           <w:bCs/>
           <w:color w:val="1A1A1A"/>
-          <w:sz w:val="21"/>
-          <w:szCs w:val="21"/>
-        </w:rPr>
-        <w:t xml:space="preserve">If DentaScale does not deliver at least 25 qualified leads during the Client’s first month of active advertising, the Client’s second month of service fees is waived. The Client remains responsible for advertising spend in that month.</w:t>
-      </w:r>
-    </w:p>
-    <w:p>
-      <w:pPr>
-        <w:spacing w:after="140" w:line="276"/>
-      </w:pPr>
-      <w:r>
-        <w:rPr>
-          <w:rFonts w:ascii="Calibri" w:cs="Calibri" w:eastAsia="Calibri" w:hAnsi="Calibri"/>
-          <w:color w:val="1A1A1A"/>
-          <w:sz w:val="21"/>
-          <w:szCs w:val="21"/>
-        </w:rPr>
-        <w:t xml:space="preserve">For the purposes of this Agreement, a “qualified lead” means an individual who: (a) submits their contact details through a campaign run by DentaScale for the Client; (b) is located within the Client’s stated service area; and (c) enquires about a treatment the Client offers. Lead count is measured in the advertising platform’s reporting together with the campaign’s lead records, which both parties accept as the record.</w:t>
-      </w:r>
-    </w:p>
-    <w:p>
-      <w:pPr>
-        <w:spacing w:after="80" w:line="276"/>
+          <w:sz w:val="26"/>
+          <w:szCs w:val="26"/>
+        </w:rPr>
+        <w:t xml:space="preserve">4. Term and cancellation</w:t>
+      </w:r>
+    </w:p>
+    <w:p>
+      <w:pPr>
+        <w:spacing w:after="140" w:line="276"/>
+      </w:pPr>
+      <w:r>
+        <w:rPr>
+          <w:rFonts w:ascii="Calibri" w:cs="Calibri" w:eastAsia="Calibri" w:hAnsi="Calibri"/>
+          <w:color w:val="1A1A1A"/>
+          <w:sz w:val="21"/>
+          <w:szCs w:val="21"/>
+        </w:rPr>
+        <w:t xml:space="preserve">This Agreement runs month to month. There is no minimum term.</w:t>
+      </w:r>
+    </w:p>
+    <w:p>
+      <w:pPr>
+        <w:spacing w:after="140" w:line="276"/>
+      </w:pPr>
+      <w:r>
+        <w:rPr>
+          <w:rFonts w:ascii="Calibri" w:cs="Calibri" w:eastAsia="Calibri" w:hAnsi="Calibri"/>
+          <w:color w:val="1A1A1A"/>
+          <w:sz w:val="21"/>
+          <w:szCs w:val="21"/>
+        </w:rPr>
+        <w:t xml:space="preserve">Either party may cancel by giving written notice (email is sufficient) at least 7 days before the next billing date. Fees already paid for the current month are non-refundable, and DentaScale will complete the month in full.</w:t>
+      </w:r>
+    </w:p>
+    <w:p>
+      <w:pPr>
+        <w:spacing w:after="140" w:line="276"/>
+      </w:pPr>
+      <w:r>
+        <w:rPr>
+          <w:rFonts w:ascii="Calibri" w:cs="Calibri" w:eastAsia="Calibri" w:hAnsi="Calibri"/>
+          <w:color w:val="1A1A1A"/>
+          <w:sz w:val="21"/>
+          <w:szCs w:val="21"/>
+        </w:rPr>
+        <w:t xml:space="preserve">On cancellation, DentaScale will return control of any advertising accounts it created on the Client’s behalf and remove its own access within 5 business days.</w:t>
+      </w:r>
+    </w:p>
+    <w:p>
+      <w:pPr>
+        <w:pStyle w:val="Heading1"/>
+        <w:spacing w:after="160" w:before="360"/>
       </w:pPr>
       <w:r>
         <w:rPr>
@@ -405,10 +463,10 @@
           <w:b/>
           <w:bCs/>
           <w:color w:val="1A1A1A"/>
-          <w:sz w:val="21"/>
-          <w:szCs w:val="21"/>
-        </w:rPr>
-        <w:t xml:space="preserve">The guarantee is conditional on all of the following:</w:t>
+          <w:sz w:val="26"/>
+          <w:szCs w:val="26"/>
+        </w:rPr>
+        <w:t xml:space="preserve">5. Client responsibilities</w:t>
       </w:r>
     </w:p>
     <w:p>
@@ -427,7 +485,7 @@
           <w:sz w:val="21"/>
           <w:szCs w:val="21"/>
         </w:rPr>
-        <w:t xml:space="preserve">The Client maintains advertising spend of at least $50 per day for the full month</w:t>
+        <w:t xml:space="preserve">Provide account access as set out in the onboarding access guide within 5 business days</w:t>
       </w:r>
     </w:p>
     <w:p>
@@ -446,7 +504,7 @@
           <w:sz w:val="21"/>
           <w:szCs w:val="21"/>
         </w:rPr>
-        <w:t xml:space="preserve">Campaigns run for a continuous period of at least 30 days without being paused at the Client’s request</w:t>
+        <w:t xml:space="preserve">Maintain advertising spend of at least $50 per day</w:t>
       </w:r>
     </w:p>
     <w:p>
@@ -465,7 +523,7 @@
           <w:sz w:val="21"/>
           <w:szCs w:val="21"/>
         </w:rPr>
-        <w:t xml:space="preserve">The Client provides account access and any requested materials within 5 business days of the Start Date</w:t>
+        <w:t xml:space="preserve">Film and send the footage requested in the shot list, and approve creative without undue delay</w:t>
       </w:r>
     </w:p>
     <w:p>
@@ -484,142 +542,7 @@
           <w:sz w:val="21"/>
           <w:szCs w:val="21"/>
         </w:rPr>
-        <w:t xml:space="preserve">The Client does not materially change the agreed offer mid-month without DentaScale’s agreement</w:t>
-      </w:r>
-    </w:p>
-    <w:p>
-      <w:pPr>
-        <w:spacing w:after="140" w:line="276"/>
-      </w:pPr>
-      <w:r>
-        <w:rPr>
-          <w:rFonts w:ascii="Calibri" w:cs="Calibri" w:eastAsia="Calibri" w:hAnsi="Calibri"/>
-          <w:color w:val="1A1A1A"/>
-          <w:sz w:val="21"/>
-          <w:szCs w:val="21"/>
-        </w:rPr>
-        <w:t xml:space="preserve">The guarantee relates to lead volume only. DentaScale does not guarantee that any particular number of leads will be booked, that any booked patient will attend an appointment, or that any patient will accept treatment, as those outcomes depend on the patient and on the Client’s own consultation and practice operations.</w:t>
-      </w:r>
-    </w:p>
-    <w:p>
-      <w:pPr>
-        <w:pStyle w:val="Heading1"/>
-        <w:spacing w:after="160" w:before="360"/>
-      </w:pPr>
-      <w:r>
-        <w:rPr>
-          <w:rFonts w:ascii="Calibri" w:cs="Calibri" w:eastAsia="Calibri" w:hAnsi="Calibri"/>
-          <w:b/>
-          <w:bCs/>
-          <w:color w:val="1A1A1A"/>
-          <w:sz w:val="26"/>
-          <w:szCs w:val="26"/>
-        </w:rPr>
-        <w:t xml:space="preserve">4. Advertising spend</w:t>
-      </w:r>
-    </w:p>
-    <w:p>
-      <w:pPr>
-        <w:spacing w:after="140" w:line="276"/>
-      </w:pPr>
-      <w:r>
-        <w:rPr>
-          <w:rFonts w:ascii="Calibri" w:cs="Calibri" w:eastAsia="Calibri" w:hAnsi="Calibri"/>
-          <w:color w:val="1A1A1A"/>
-          <w:sz w:val="21"/>
-          <w:szCs w:val="21"/>
-        </w:rPr>
-        <w:t xml:space="preserve">Advertising spend is separate from DentaScale’s fee and is paid by the Client directly to the advertising platforms. DentaScale does not handle, hold, or invoice advertising spend.</w:t>
-      </w:r>
-    </w:p>
-    <w:p>
-      <w:pPr>
-        <w:spacing w:after="140" w:line="276"/>
-      </w:pPr>
-      <w:r>
-        <w:rPr>
-          <w:rFonts w:ascii="Calibri" w:cs="Calibri" w:eastAsia="Calibri" w:hAnsi="Calibri"/>
-          <w:color w:val="1A1A1A"/>
-          <w:sz w:val="21"/>
-          <w:szCs w:val="21"/>
-        </w:rPr>
-        <w:t xml:space="preserve">The Client agrees to maintain advertising spend of at least $50 per day. Raising the budget above this level does not change DentaScale’s fee.</w:t>
-      </w:r>
-    </w:p>
-    <w:p>
-      <w:pPr>
-        <w:pStyle w:val="Heading1"/>
-        <w:spacing w:after="160" w:before="360"/>
-      </w:pPr>
-      <w:r>
-        <w:rPr>
-          <w:rFonts w:ascii="Calibri" w:cs="Calibri" w:eastAsia="Calibri" w:hAnsi="Calibri"/>
-          <w:b/>
-          <w:bCs/>
-          <w:color w:val="1A1A1A"/>
-          <w:sz w:val="26"/>
-          <w:szCs w:val="26"/>
-        </w:rPr>
-        <w:t xml:space="preserve">5. Term and cancellation</w:t>
-      </w:r>
-    </w:p>
-    <w:p>
-      <w:pPr>
-        <w:spacing w:after="140" w:line="276"/>
-      </w:pPr>
-      <w:r>
-        <w:rPr>
-          <w:rFonts w:ascii="Calibri" w:cs="Calibri" w:eastAsia="Calibri" w:hAnsi="Calibri"/>
-          <w:color w:val="1A1A1A"/>
-          <w:sz w:val="21"/>
-          <w:szCs w:val="21"/>
-        </w:rPr>
-        <w:t xml:space="preserve">This Agreement runs month to month. There is no minimum term.</w:t>
-      </w:r>
-    </w:p>
-    <w:p>
-      <w:pPr>
-        <w:spacing w:after="140" w:line="276"/>
-      </w:pPr>
-      <w:r>
-        <w:rPr>
-          <w:rFonts w:ascii="Calibri" w:cs="Calibri" w:eastAsia="Calibri" w:hAnsi="Calibri"/>
-          <w:color w:val="1A1A1A"/>
-          <w:sz w:val="21"/>
-          <w:szCs w:val="21"/>
-        </w:rPr>
-        <w:t xml:space="preserve">Either party may cancel by giving written notice (email is sufficient) at least 7 days before the next billing date. Fees already paid for the current month are non-refundable, and DentaScale will complete the month in full.</w:t>
-      </w:r>
-    </w:p>
-    <w:p>
-      <w:pPr>
-        <w:spacing w:after="140" w:line="276"/>
-      </w:pPr>
-      <w:r>
-        <w:rPr>
-          <w:rFonts w:ascii="Calibri" w:cs="Calibri" w:eastAsia="Calibri" w:hAnsi="Calibri"/>
-          <w:color w:val="1A1A1A"/>
-          <w:sz w:val="21"/>
-          <w:szCs w:val="21"/>
-        </w:rPr>
-        <w:t xml:space="preserve">On cancellation, DentaScale will return control of any advertising accounts it created on the Client’s behalf and remove its own access within 5 business days.</w:t>
-      </w:r>
-    </w:p>
-    <w:p>
-      <w:pPr>
-        <w:pStyle w:val="Heading1"/>
-        <w:spacing w:after="160" w:before="360"/>
-      </w:pPr>
-      <w:r>
-        <w:rPr>
-          <w:rFonts w:ascii="Calibri" w:cs="Calibri" w:eastAsia="Calibri" w:hAnsi="Calibri"/>
-          <w:b/>
-          <w:bCs/>
-          <w:color w:val="1A1A1A"/>
-          <w:sz w:val="26"/>
-          <w:szCs w:val="26"/>
-        </w:rPr>
-        <w:t xml:space="preserve">6. Client responsibilities</w:t>
+        <w:t xml:space="preserve">Keep the consultation calendar open and shared with DentaScale, and honor the consults DentaScale books</w:t>
       </w:r>
     </w:p>
     <w:p>
@@ -638,82 +561,6 @@
           <w:sz w:val="21"/>
           <w:szCs w:val="21"/>
         </w:rPr>
-        <w:t xml:space="preserve">Provide account access as set out in the onboarding access guide within 5 business days</w:t>
-      </w:r>
-    </w:p>
-    <w:p>
-      <w:pPr>
-        <w:pStyle w:val="ListParagraph"/>
-        <w:numPr>
-          <w:ilvl w:val="0"/>
-          <w:numId w:val="2"/>
-        </w:numPr>
-        <w:spacing w:after="80" w:line="276"/>
-      </w:pPr>
-      <w:r>
-        <w:rPr>
-          <w:rFonts w:ascii="Calibri" w:cs="Calibri" w:eastAsia="Calibri" w:hAnsi="Calibri"/>
-          <w:color w:val="1A1A1A"/>
-          <w:sz w:val="21"/>
-          <w:szCs w:val="21"/>
-        </w:rPr>
-        <w:t xml:space="preserve">Maintain advertising spend of at least $50 per day</w:t>
-      </w:r>
-    </w:p>
-    <w:p>
-      <w:pPr>
-        <w:pStyle w:val="ListParagraph"/>
-        <w:numPr>
-          <w:ilvl w:val="0"/>
-          <w:numId w:val="2"/>
-        </w:numPr>
-        <w:spacing w:after="80" w:line="276"/>
-      </w:pPr>
-      <w:r>
-        <w:rPr>
-          <w:rFonts w:ascii="Calibri" w:cs="Calibri" w:eastAsia="Calibri" w:hAnsi="Calibri"/>
-          <w:color w:val="1A1A1A"/>
-          <w:sz w:val="21"/>
-          <w:szCs w:val="21"/>
-        </w:rPr>
-        <w:t xml:space="preserve">Film and send the footage requested in the shot list, and approve creative without undue delay</w:t>
-      </w:r>
-    </w:p>
-    <w:p>
-      <w:pPr>
-        <w:pStyle w:val="ListParagraph"/>
-        <w:numPr>
-          <w:ilvl w:val="0"/>
-          <w:numId w:val="2"/>
-        </w:numPr>
-        <w:spacing w:after="80" w:line="276"/>
-      </w:pPr>
-      <w:r>
-        <w:rPr>
-          <w:rFonts w:ascii="Calibri" w:cs="Calibri" w:eastAsia="Calibri" w:hAnsi="Calibri"/>
-          <w:color w:val="1A1A1A"/>
-          <w:sz w:val="21"/>
-          <w:szCs w:val="21"/>
-        </w:rPr>
-        <w:t xml:space="preserve">Keep the consultation calendar open and shared with DentaScale, and honor the consults DentaScale books</w:t>
-      </w:r>
-    </w:p>
-    <w:p>
-      <w:pPr>
-        <w:pStyle w:val="ListParagraph"/>
-        <w:numPr>
-          <w:ilvl w:val="0"/>
-          <w:numId w:val="2"/>
-        </w:numPr>
-        <w:spacing w:after="80" w:line="276"/>
-      </w:pPr>
-      <w:r>
-        <w:rPr>
-          <w:rFonts w:ascii="Calibri" w:cs="Calibri" w:eastAsia="Calibri" w:hAnsi="Calibri"/>
-          <w:color w:val="1A1A1A"/>
-          <w:sz w:val="21"/>
-          <w:szCs w:val="21"/>
-        </w:rPr>
         <w:t xml:space="preserve">Ensure all claims about the practice, its services, and its credentials are accurate and compliant with applicable dental advertising rules</w:t>
       </w:r>
     </w:p>
@@ -731,7 +578,7 @@
           <w:sz w:val="26"/>
           <w:szCs w:val="26"/>
         </w:rPr>
-        <w:t xml:space="preserve">7. Content, ownership, and usage</w:t>
+        <w:t xml:space="preserve">6. Content, ownership, and usage</w:t>
       </w:r>
     </w:p>
     <w:p>
@@ -790,7 +637,7 @@
           <w:sz w:val="26"/>
           <w:szCs w:val="26"/>
         </w:rPr>
-        <w:t xml:space="preserve">8. Confidentiality and data</w:t>
+        <w:t xml:space="preserve">7. Confidentiality and data</w:t>
       </w:r>
     </w:p>
     <w:p>
@@ -835,7 +682,7 @@
           <w:sz w:val="26"/>
           <w:szCs w:val="26"/>
         </w:rPr>
-        <w:t xml:space="preserve">9. Limitation of liability</w:t>
+        <w:t xml:space="preserve">8. Limitation of liability</w:t>
       </w:r>
     </w:p>
     <w:p>
@@ -880,7 +727,7 @@
           <w:sz w:val="26"/>
           <w:szCs w:val="26"/>
         </w:rPr>
-        <w:t xml:space="preserve">10. General</w:t>
+        <w:t xml:space="preserve">9. General</w:t>
       </w:r>
     </w:p>
     <w:p>

</xml_diff>